<commit_message>
CR-002 section 29: with tracking off Word makes typed text plain (check 21, re-run)
Jason re-ran check 21 with tracking truly off (no w:trackRevisions in any saved
settings.xml): text typed inside another author's insertion, inside the typist's own, or
inside a deletion is plain, and splits that revision; typed at an insertion's end it is
plain after it. The engine keeps such text inside the w:ins ("veXry", "very Y"), so the
editor's reviewer was right and both sides change. With check 20 this makes one rule:
text typed where a revision is splits it, and is the typist's w:ins with tracking on and
plain with it off.

Also corrected: a point inside deleted text is not addressable through the content API
(its offsets are the accepted view's), so the "refuses to type inside a deletion" of
b63ae97 was a reading of the code, not reachable. The re-run's files replace the first
run's.

Co-Authored-By: Claude Opus 5.5 <noreply@anthropic.com>
</commit_message>
<xml_diff>
--- a/test/fixtures/revisions/check21/21a-in-insertion.docx
+++ b/test/fixtures/revisions/check21/21a-in-insertion.docx
@@ -85,12 +85,10 @@
           <w:t>ve</w:t>
         </w:r>
       </w:ins>
-      <w:ins w:id="2" w:author="Author B" w:date="2026-09-28T09:50:00Z" w16du:dateUtc="2026-09-27T23:50:00Z">
-        <w:r>
-          <w:t>X</w:t>
-        </w:r>
-      </w:ins>
-      <w:ins w:id="3" w:author="Author A" w:date="2026-09-28T05:46:00Z">
+      <w:r>
+        <w:t>X</w:t>
+      </w:r>
+      <w:ins w:id="2" w:author="Author A" w:date="2026-09-28T05:46:00Z">
         <w:r>
           <w:t xml:space="preserve">ry </w:t>
         </w:r>
@@ -98,7 +96,7 @@
       <w:r>
         <w:t xml:space="preserve">lazy dog near the </w:t>
       </w:r>
-      <w:del w:id="4" w:author="Author A" w:date="2026-09-28T05:46:00Z">
+      <w:del w:id="3" w:author="Author A" w:date="2026-09-28T05:46:00Z">
         <w:r>
           <w:delText xml:space="preserve">old </w:delText>
         </w:r>
@@ -106,7 +104,7 @@
       <w:r>
         <w:t>stone bridge</w:t>
       </w:r>
-      <w:del w:id="5" w:author="Author B" w:date="2026-09-28T05:51:00Z">
+      <w:del w:id="4" w:author="Author B" w:date="2026-09-28T05:51:00Z">
         <w:r>
           <w:delText xml:space="preserve"> at dawn</w:delText>
         </w:r>
@@ -147,8 +145,8 @@
       <w:r>
         <w:t xml:space="preserve">Cows graze in the </w:t>
       </w:r>
-      <w:ins w:id="6" w:author="Author A" w:date="2026-09-28T05:46:00Z">
-        <w:del w:id="7" w:author="Author B" w:date="2026-09-28T05:51:00Z">
+      <w:ins w:id="5" w:author="Author A" w:date="2026-09-28T05:46:00Z">
+        <w:del w:id="6" w:author="Author B" w:date="2026-09-28T05:51:00Z">
           <w:r>
             <w:delText xml:space="preserve">green </w:delText>
           </w:r>
@@ -179,17 +177,17 @@
     <w:p>
       <w:pPr>
         <w:rPr>
-          <w:moveTo w:id="8" w:author="Author A" w:date="2026-09-28T05:47:00Z"/>
-        </w:rPr>
-      </w:pPr>
-      <w:moveToRangeStart w:id="9" w:author="Author A" w:date="2026-09-28T05:47:00Z" w:name="move241466837"/>
-      <w:moveTo w:id="10" w:author="Author A" w:date="2026-09-28T05:47:00Z">
+          <w:moveTo w:id="7" w:author="Author A" w:date="2026-09-28T05:47:00Z"/>
+        </w:rPr>
+      </w:pPr>
+      <w:moveToRangeStart w:id="8" w:author="Author A" w:date="2026-09-28T05:47:00Z" w:name="move241466837"/>
+      <w:moveTo w:id="9" w:author="Author A" w:date="2026-09-28T05:47:00Z">
         <w:r>
           <w:t>The second paragraph of the move: it goes before the first.</w:t>
         </w:r>
       </w:moveTo>
     </w:p>
-    <w:moveToRangeEnd w:id="9"/>
+    <w:moveToRangeEnd w:id="8"/>
     <w:p>
       <w:r>
         <w:t>The first paragraph of the move: it stays where it is.</w:t>
@@ -198,17 +196,17 @@
     <w:p>
       <w:pPr>
         <w:rPr>
-          <w:moveFrom w:id="11" w:author="Author A" w:date="2026-09-28T05:47:00Z"/>
-        </w:rPr>
-      </w:pPr>
-      <w:moveFromRangeStart w:id="12" w:author="Author A" w:date="2026-09-28T05:47:00Z" w:name="move241466837"/>
-      <w:moveFrom w:id="13" w:author="Author A" w:date="2026-09-28T05:47:00Z">
+          <w:moveFrom w:id="10" w:author="Author A" w:date="2026-09-28T05:47:00Z"/>
+        </w:rPr>
+      </w:pPr>
+      <w:moveFromRangeStart w:id="11" w:author="Author A" w:date="2026-09-28T05:47:00Z" w:name="move241466837"/>
+      <w:moveFrom w:id="12" w:author="Author A" w:date="2026-09-28T05:47:00Z">
         <w:r>
           <w:t>The second paragraph of the move: it goes before the first.</w:t>
         </w:r>
       </w:moveFrom>
     </w:p>
-    <w:moveFromRangeEnd w:id="12"/>
+    <w:moveFromRangeEnd w:id="11"/>
     <w:p>
       <w:r>
         <w:t>The third paragraph of the move: it stays where it is.</w:t>
@@ -240,35 +238,35 @@
       <w:r>
         <w:rPr>
           <w:b/>
+          <w:rPrChange w:id="13" w:author="Author A" w:date="2026-09-28T05:47:00Z">
+            <w:rPr/>
+          </w:rPrChange>
+        </w:rPr>
+        <w:t>alpha</w:t>
+      </w:r>
+      <w:r>
+        <w:t xml:space="preserve"> becomes bold, the word</w:t>
+      </w:r>
+      <w:r>
+        <w:rPr>
+          <w:color w:val="FF0000"/>
           <w:rPrChange w:id="14" w:author="Author A" w:date="2026-09-28T05:47:00Z">
             <w:rPr/>
           </w:rPrChange>
         </w:rPr>
-        <w:t>alpha</w:t>
-      </w:r>
-      <w:r>
-        <w:t xml:space="preserve"> becomes bold, the word</w:t>
-      </w:r>
-      <w:r>
-        <w:rPr>
-          <w:color w:val="FF0000"/>
+        <w:t xml:space="preserve"> bravo </w:t>
+      </w:r>
+      <w:r>
+        <w:t xml:space="preserve">becomes red, and the word </w:t>
+      </w:r>
+      <w:r>
+        <w:rPr>
+          <w:i/>
+          <w:u w:val="single"/>
           <w:rPrChange w:id="15" w:author="Author A" w:date="2026-09-28T05:47:00Z">
             <w:rPr/>
           </w:rPrChange>
         </w:rPr>
-        <w:t xml:space="preserve"> bravo </w:t>
-      </w:r>
-      <w:r>
-        <w:t xml:space="preserve">becomes red, and the word </w:t>
-      </w:r>
-      <w:r>
-        <w:rPr>
-          <w:i/>
-          <w:u w:val="single"/>
-          <w:rPrChange w:id="16" w:author="Author A" w:date="2026-09-28T05:47:00Z">
-            <w:rPr/>
-          </w:rPrChange>
-        </w:rPr>
         <w:t>charlie</w:t>
       </w:r>
       <w:r>
@@ -296,33 +294,33 @@
     <w:p>
       <w:pPr>
         <w:jc w:val="center"/>
+        <w:pPrChange w:id="16" w:author="Author A" w:date="2026-09-28T05:47:00Z">
+          <w:pPr/>
+        </w:pPrChange>
+      </w:pPr>
+      <w:r>
+        <w:t>Centre this paragraph.</w:t>
+      </w:r>
+    </w:p>
+    <w:p>
+      <w:pPr>
+        <w:ind w:left="720"/>
         <w:pPrChange w:id="17" w:author="Author A" w:date="2026-09-28T05:47:00Z">
           <w:pPr/>
         </w:pPrChange>
       </w:pPr>
       <w:r>
-        <w:t>Centre this paragraph.</w:t>
-      </w:r>
-    </w:p>
-    <w:p>
-      <w:pPr>
-        <w:ind w:left="720"/>
+        <w:t>Indent this paragraph by one step.</w:t>
+      </w:r>
+    </w:p>
+    <w:p>
+      <w:pPr>
+        <w:pStyle w:val="Heading2"/>
         <w:pPrChange w:id="18" w:author="Author A" w:date="2026-09-28T05:47:00Z">
           <w:pPr/>
         </w:pPrChange>
       </w:pPr>
       <w:r>
-        <w:t>Indent this paragraph by one step.</w:t>
-      </w:r>
-    </w:p>
-    <w:p>
-      <w:pPr>
-        <w:pStyle w:val="Heading2"/>
-        <w:pPrChange w:id="19" w:author="Author A" w:date="2026-09-28T05:47:00Z">
-          <w:pPr/>
-        </w:pPrChange>
-      </w:pPr>
-      <w:r>
         <w:t>Give this paragraph the style Heading 2.</w:t>
       </w:r>
     </w:p>
@@ -347,7 +345,7 @@
     <w:p>
       <w:pPr>
         <w:rPr>
-          <w:ins w:id="20" w:author="Author A" w:date="2026-09-28T05:47:00Z"/>
+          <w:ins w:id="19" w:author="Author A" w:date="2026-09-28T05:47:00Z"/>
         </w:rPr>
       </w:pPr>
       <w:r>
@@ -362,7 +360,7 @@
     <w:p>
       <w:pPr>
         <w:rPr>
-          <w:del w:id="21" w:author="Author A" w:date="2026-09-28T05:48:00Z"/>
+          <w:del w:id="20" w:author="Author A" w:date="2026-09-28T05:48:00Z"/>
         </w:rPr>
       </w:pPr>
       <w:r>
@@ -504,7 +502,7 @@
       </w:tr>
       <w:tr>
         <w:trPr>
-          <w:ins w:id="22" w:author="Author A" w:date="2026-09-28T05:48:00Z"/>
+          <w:ins w:id="21" w:author="Author A" w:date="2026-09-28T05:48:00Z"/>
         </w:trPr>
         <w:tc>
           <w:tcPr>
@@ -513,10 +511,10 @@
           <w:p>
             <w:pPr>
               <w:rPr>
-                <w:ins w:id="23" w:author="Author A" w:date="2026-09-28T05:48:00Z"/>
+                <w:ins w:id="22" w:author="Author A" w:date="2026-09-28T05:48:00Z"/>
               </w:rPr>
             </w:pPr>
-            <w:ins w:id="24" w:author="Author A" w:date="2026-09-28T05:48:00Z">
+            <w:ins w:id="23" w:author="Author A" w:date="2026-09-28T05:48:00Z">
               <w:r>
                 <w:t>New</w:t>
               </w:r>
@@ -530,10 +528,10 @@
           <w:p>
             <w:pPr>
               <w:rPr>
-                <w:ins w:id="25" w:author="Author A" w:date="2026-09-28T05:48:00Z"/>
+                <w:ins w:id="24" w:author="Author A" w:date="2026-09-28T05:48:00Z"/>
               </w:rPr>
             </w:pPr>
-            <w:ins w:id="26" w:author="Author A" w:date="2026-09-28T05:48:00Z">
+            <w:ins w:id="25" w:author="Author A" w:date="2026-09-28T05:48:00Z">
               <w:r>
                 <w:t>New</w:t>
               </w:r>
@@ -547,10 +545,10 @@
           <w:p>
             <w:pPr>
               <w:rPr>
-                <w:ins w:id="27" w:author="Author A" w:date="2026-09-28T05:48:00Z"/>
+                <w:ins w:id="26" w:author="Author A" w:date="2026-09-28T05:48:00Z"/>
               </w:rPr>
             </w:pPr>
-            <w:ins w:id="28" w:author="Author A" w:date="2026-09-28T05:48:00Z">
+            <w:ins w:id="27" w:author="Author A" w:date="2026-09-28T05:48:00Z">
               <w:r>
                 <w:t>new</w:t>
               </w:r>
@@ -560,7 +558,7 @@
       </w:tr>
       <w:tr>
         <w:trPr>
-          <w:del w:id="29" w:author="Author A" w:date="2026-09-28T05:48:00Z"/>
+          <w:del w:id="28" w:author="Author A" w:date="2026-09-28T05:48:00Z"/>
         </w:trPr>
         <w:tc>
           <w:tcPr>
@@ -569,10 +567,10 @@
           <w:p>
             <w:pPr>
               <w:rPr>
-                <w:del w:id="30" w:author="Author A" w:date="2026-09-28T05:48:00Z"/>
+                <w:del w:id="29" w:author="Author A" w:date="2026-09-28T05:48:00Z"/>
               </w:rPr>
             </w:pPr>
-            <w:del w:id="31" w:author="Author A" w:date="2026-09-28T05:48:00Z">
+            <w:del w:id="30" w:author="Author A" w:date="2026-09-28T05:48:00Z">
               <w:r>
                 <w:delText>3</w:delText>
               </w:r>
@@ -586,10 +584,10 @@
           <w:p>
             <w:pPr>
               <w:rPr>
-                <w:del w:id="32" w:author="Author A" w:date="2026-09-28T05:48:00Z"/>
+                <w:del w:id="31" w:author="Author A" w:date="2026-09-28T05:48:00Z"/>
               </w:rPr>
             </w:pPr>
-            <w:del w:id="33" w:author="Author A" w:date="2026-09-28T05:48:00Z">
+            <w:del w:id="32" w:author="Author A" w:date="2026-09-28T05:48:00Z">
               <w:r>
                 <w:delText>Delete</w:delText>
               </w:r>
@@ -603,10 +601,10 @@
           <w:p>
             <w:pPr>
               <w:rPr>
-                <w:del w:id="34" w:author="Author A" w:date="2026-09-28T05:48:00Z"/>
+                <w:del w:id="33" w:author="Author A" w:date="2026-09-28T05:48:00Z"/>
               </w:rPr>
             </w:pPr>
-            <w:del w:id="35" w:author="Author A" w:date="2026-09-28T05:48:00Z">
+            <w:del w:id="34" w:author="Author A" w:date="2026-09-28T05:48:00Z">
               <w:r>
                 <w:delText>this row is deleted</w:delText>
               </w:r>
@@ -644,7 +642,7 @@
         <w:tblW w:w="9027" w:type="dxa"/>
         <w:jc w:val="center"/>
         <w:tblLook w:val="04A0" w:firstRow="1" w:lastRow="0" w:firstColumn="1" w:lastColumn="0" w:noHBand="0" w:noVBand="1"/>
-        <w:tblPrChange w:id="36" w:author="Author A" w:date="2026-09-28T05:49:00Z">
+        <w:tblPrChange w:id="35" w:author="Author A" w:date="2026-09-28T05:49:00Z">
           <w:tblPr>
             <w:tblStyle w:val="TableGrid"/>
             <w:tblW w:w="9027" w:type="dxa"/>
@@ -655,7 +653,7 @@
       <w:tblGrid>
         <w:gridCol w:w="4513"/>
         <w:gridCol w:w="4514"/>
-        <w:tblGridChange w:id="37">
+        <w:tblGridChange w:id="36">
           <w:tblGrid>
             <w:gridCol w:w="4513"/>
             <w:gridCol w:w="4514"/>
@@ -670,7 +668,7 @@
           <w:tcPr>
             <w:tcW w:w="4513" w:type="dxa"/>
             <w:shd w:val="clear" w:color="auto" w:fill="FFFF00"/>
-            <w:tcPrChange w:id="38" w:author="Author A" w:date="2026-09-28T05:49:00Z">
+            <w:tcPrChange w:id="37" w:author="Author A" w:date="2026-09-28T05:49:00Z">
               <w:tcPr>
                 <w:tcW w:w="4513" w:type="dxa"/>
               </w:tcPr>
@@ -685,7 +683,7 @@
         <w:tc>
           <w:tcPr>
             <w:tcW w:w="4514" w:type="dxa"/>
-            <w:tcPrChange w:id="39" w:author="Author A" w:date="2026-09-28T05:49:00Z">
+            <w:tcPrChange w:id="38" w:author="Author A" w:date="2026-09-28T05:49:00Z">
               <w:tcPr>
                 <w:tcW w:w="4514" w:type="dxa"/>
               </w:tcPr>
@@ -705,7 +703,7 @@
         <w:tc>
           <w:tcPr>
             <w:tcW w:w="4513" w:type="dxa"/>
-            <w:tcPrChange w:id="40" w:author="Author A" w:date="2026-09-28T05:48:00Z">
+            <w:tcPrChange w:id="39" w:author="Author A" w:date="2026-09-28T05:48:00Z">
               <w:tcPr>
                 <w:tcW w:w="4513" w:type="dxa"/>
               </w:tcPr>
@@ -720,7 +718,7 @@
         <w:tc>
           <w:tcPr>
             <w:tcW w:w="4514" w:type="dxa"/>
-            <w:tcPrChange w:id="41" w:author="Author A" w:date="2026-09-28T05:48:00Z">
+            <w:tcPrChange w:id="40" w:author="Author A" w:date="2026-09-28T05:48:00Z">
               <w:tcPr>
                 <w:tcW w:w="4514" w:type="dxa"/>
               </w:tcPr>
@@ -764,6 +762,25 @@
           <w:ilvl w:val="0"/>
           <w:numId w:val="4"/>
         </w:numPr>
+        <w:pPrChange w:id="41" w:author="Author A" w:date="2026-09-28T05:49:00Z">
+          <w:pPr>
+            <w:numPr>
+              <w:numId w:val="3"/>
+            </w:numPr>
+            <w:ind w:left="720" w:hanging="360"/>
+          </w:pPr>
+        </w:pPrChange>
+      </w:pPr>
+      <w:r>
+        <w:t>The first numbered item.</w:t>
+      </w:r>
+    </w:p>
+    <w:p>
+      <w:pPr>
+        <w:numPr>
+          <w:ilvl w:val="0"/>
+          <w:numId w:val="4"/>
+        </w:numPr>
         <w:pPrChange w:id="42" w:author="Author A" w:date="2026-09-28T05:49:00Z">
           <w:pPr>
             <w:numPr>
@@ -774,7 +791,7 @@
         </w:pPrChange>
       </w:pPr>
       <w:r>
-        <w:t>The first numbered item.</w:t>
+        <w:t>The second numbered item.</w:t>
       </w:r>
     </w:p>
     <w:p>
@@ -793,25 +810,6 @@
         </w:pPrChange>
       </w:pPr>
       <w:r>
-        <w:t>The second numbered item.</w:t>
-      </w:r>
-    </w:p>
-    <w:p>
-      <w:pPr>
-        <w:numPr>
-          <w:ilvl w:val="0"/>
-          <w:numId w:val="4"/>
-        </w:numPr>
-        <w:pPrChange w:id="44" w:author="Author A" w:date="2026-09-28T05:49:00Z">
-          <w:pPr>
-            <w:numPr>
-              <w:numId w:val="3"/>
-            </w:numPr>
-            <w:ind w:left="720" w:hanging="360"/>
-          </w:pPr>
-        </w:pPrChange>
-      </w:pPr>
-      <w:r>
         <w:t>The third numbered item.</w:t>
       </w:r>
     </w:p>
@@ -842,7 +840,7 @@
       <w:r>
         <w:t>Left</w:t>
       </w:r>
-      <w:del w:id="45" w:author="Author A" w:date="2026-09-28T05:49:00Z">
+      <w:del w:id="44" w:author="Author A" w:date="2026-09-28T05:49:00Z">
         <w:r>
           <w:tab/>
         </w:r>
@@ -850,7 +848,7 @@
       <w:r>
         <w:t>right: the tab between them is deleted. A line break goes after the word break</w:t>
       </w:r>
-      <w:ins w:id="46" w:author="Author A" w:date="2026-09-28T05:49:00Z">
+      <w:ins w:id="45" w:author="Author A" w:date="2026-09-28T05:49:00Z">
         <w:r>
           <w:br/>
         </w:r>
@@ -858,7 +856,7 @@
       <w:r>
         <w:t xml:space="preserve"> here. The footnote goes at the end of this sentence.</w:t>
       </w:r>
-      <w:ins w:id="47" w:author="Author A" w:date="2026-09-28T05:49:00Z">
+      <w:ins w:id="46" w:author="Author A" w:date="2026-09-28T05:49:00Z">
         <w:r>
           <w:rPr>
             <w:rStyle w:val="FootnoteReference"/>
@@ -906,44 +904,44 @@
       </w:r>
     </w:p>
     <w:p>
+      <w:commentRangeStart w:id="49"/>
       <w:commentRangeStart w:id="50"/>
-      <w:commentRangeStart w:id="51"/>
       <w:r>
         <w:t>Author A comments on this sentence, and Author B answers.</w:t>
       </w:r>
-      <w:commentRangeEnd w:id="50"/>
+      <w:commentRangeEnd w:id="49"/>
       <w:r>
         <w:rPr>
           <w:rStyle w:val="CommentReference"/>
           <w:sz w:val="22"/>
           <w:szCs w:val="22"/>
         </w:rPr>
-        <w:commentReference w:id="50"/>
-      </w:r>
-      <w:commentRangeEnd w:id="51"/>
+        <w:commentReference w:id="49"/>
+      </w:r>
+      <w:commentRangeEnd w:id="50"/>
       <w:r>
         <w:rPr>
           <w:rStyle w:val="CommentReference"/>
           <w:sz w:val="22"/>
           <w:szCs w:val="22"/>
         </w:rPr>
-        <w:commentReference w:id="51"/>
+        <w:commentReference w:id="50"/>
       </w:r>
       <w:r>
         <w:t xml:space="preserve"> </w:t>
       </w:r>
-      <w:commentRangeStart w:id="52"/>
+      <w:commentRangeStart w:id="51"/>
       <w:r>
         <w:t>Author B comments on this sentence alone.</w:t>
       </w:r>
-      <w:commentRangeEnd w:id="52"/>
+      <w:commentRangeEnd w:id="51"/>
       <w:r>
         <w:rPr>
           <w:rStyle w:val="CommentReference"/>
           <w:sz w:val="22"/>
           <w:szCs w:val="22"/>
         </w:rPr>
-        <w:commentReference w:id="52"/>
+        <w:commentReference w:id="51"/>
       </w:r>
     </w:p>
     <w:p>
@@ -974,7 +972,7 @@
       <w:pgMar w:top="720" w:right="720" w:bottom="720" w:left="720" w:header="708" w:footer="708" w:gutter="0"/>
       <w:cols w:space="720"/>
       <w:docGrid w:linePitch="299"/>
-      <w:sectPrChange w:id="53" w:author="Author A" w:date="2026-09-28T05:50:00Z">
+      <w:sectPrChange w:id="52" w:author="Author A" w:date="2026-09-28T05:50:00Z">
         <w:sectPr>
           <w:pgMar w:top="1440" w:right="1440" w:bottom="1440" w:left="1440" w:header="708" w:footer="708" w:gutter="0"/>
           <w:docGrid w:linePitch="0"/>
@@ -987,7 +985,7 @@
 
 <file path=word/comments.xml><?xml version="1.0" encoding="utf-8"?>
 <w:comments xmlns:wpc="http://schemas.microsoft.com/office/word/2010/wordprocessingCanvas" xmlns:cx="http://schemas.microsoft.com/office/drawing/2014/chartex" xmlns:cx1="http://schemas.microsoft.com/office/drawing/2015/9/8/chartex" xmlns:cx2="http://schemas.microsoft.com/office/drawing/2015/10/21/chartex" xmlns:cx3="http://schemas.microsoft.com/office/drawing/2016/5/9/chartex" xmlns:cx4="http://schemas.microsoft.com/office/drawing/2016/5/10/chartex" xmlns:cx5="http://schemas.microsoft.com/office/drawing/2016/5/11/chartex" xmlns:cx6="http://schemas.microsoft.com/office/drawing/2016/5/12/chartex" xmlns:cx7="http://schemas.microsoft.com/office/drawing/2016/5/13/chartex" xmlns:cx8="http://schemas.microsoft.com/office/drawing/2016/5/14/chartex" xmlns:mc="http://schemas.openxmlformats.org/markup-compatibility/2006" xmlns:aink="http://schemas.microsoft.com/office/drawing/2016/ink" xmlns:am3d="http://schemas.microsoft.com/office/drawing/2017/model3d" xmlns:o="urn:schemas-microsoft-com:office:office" xmlns:oel="http://schemas.microsoft.com/office/2019/extlst" xmlns:r="http://schemas.openxmlformats.org/officeDocument/2006/relationships" xmlns:m="http://schemas.openxmlformats.org/officeDocument/2006/math" xmlns:v="urn:schemas-microsoft-com:vml" xmlns:wp14="http://schemas.microsoft.com/office/word/2010/wordprocessingDrawing" xmlns:wp="http://schemas.openxmlformats.org/drawingml/2006/wordprocessingDrawing" xmlns:w10="urn:schemas-microsoft-com:office:word" xmlns:w="http://schemas.openxmlformats.org/wordprocessingml/2006/main" xmlns:w14="http://schemas.microsoft.com/office/word/2010/wordml" xmlns:w15="http://schemas.microsoft.com/office/word/2012/wordml" xmlns:w16cex="http://schemas.microsoft.com/office/word/2018/wordml/cex" xmlns:w16cid="http://schemas.microsoft.com/office/word/2016/wordml/cid" xmlns:w16="http://schemas.microsoft.com/office/word/2018/wordml" xmlns:w16du="http://schemas.microsoft.com/office/word/2023/wordml/word16du" xmlns:w16sdtdh="http://schemas.microsoft.com/office/word/2020/wordml/sdtdatahash" xmlns:w16sdtfl="http://schemas.microsoft.com/office/word/2024/wordml/sdtformatlock" xmlns:w16se="http://schemas.microsoft.com/office/word/2015/wordml/symex" xmlns:wpg="http://schemas.microsoft.com/office/word/2010/wordprocessingGroup" xmlns:wpi="http://schemas.microsoft.com/office/word/2010/wordprocessingInk" xmlns:wne="http://schemas.microsoft.com/office/word/2006/wordml" xmlns:wps="http://schemas.microsoft.com/office/word/2010/wordprocessingShape" mc:Ignorable="w14 w15 w16se w16cid w16 w16cex w16sdtdh w16sdtfl w16du wp14">
-  <w:comment w:id="50" w:author="Author A" w:date="2026-09-28T05:50:00Z" w:initials="AA">
+  <w:comment w:id="49" w:author="Author A" w:date="2026-09-28T05:50:00Z" w:initials="AA">
     <w:p>
       <w:pPr>
         <w:pStyle w:val="CommentText"/>
@@ -1008,7 +1006,7 @@
       </w:r>
     </w:p>
   </w:comment>
-  <w:comment w:id="51" w:author="Author B" w:date="2026-09-28T05:51:00Z" w:initials="BB">
+  <w:comment w:id="50" w:author="Author B" w:date="2026-09-28T05:51:00Z" w:initials="BB">
     <w:p>
       <w:pPr>
         <w:pStyle w:val="CommentText"/>
@@ -1024,7 +1022,7 @@
       </w:r>
     </w:p>
   </w:comment>
-  <w:comment w:id="52" w:author="Author B" w:date="2026-09-28T05:52:00Z" w:initials="BB">
+  <w:comment w:id="51" w:author="Author B" w:date="2026-09-28T05:52:00Z" w:initials="BB">
     <w:p>
       <w:pPr>
         <w:pStyle w:val="CommentText"/>
@@ -1112,12 +1110,12 @@
         <w:pStyle w:val="FootnoteText"/>
         <w:rPr>
           <w:lang w:val="en-AU"/>
-          <w:rPrChange w:id="48" w:author="Author A" w:date="2026-09-28T05:49:00Z">
+          <w:rPrChange w:id="47" w:author="Author A" w:date="2026-09-28T05:49:00Z">
             <w:rPr/>
           </w:rPrChange>
         </w:rPr>
       </w:pPr>
-      <w:ins w:id="49" w:author="Author A" w:date="2026-09-28T05:49:00Z">
+      <w:ins w:id="48" w:author="Author A" w:date="2026-09-28T05:49:00Z">
         <w:r>
           <w:rPr>
             <w:rStyle w:val="FootnoteReference"/>
@@ -1517,16 +1515,16 @@
       </w:pPr>
     </w:lvl>
   </w:abstractNum>
-  <w:num w:numId="1" w16cid:durableId="358745743">
+  <w:num w:numId="1" w16cid:durableId="1307050368">
     <w:abstractNumId w:val="3"/>
   </w:num>
-  <w:num w:numId="2" w16cid:durableId="846403267">
+  <w:num w:numId="2" w16cid:durableId="1616600700">
     <w:abstractNumId w:val="0"/>
   </w:num>
-  <w:num w:numId="3" w16cid:durableId="1381982140">
+  <w:num w:numId="3" w16cid:durableId="1686906048">
     <w:abstractNumId w:val="2"/>
   </w:num>
-  <w:num w:numId="4" w16cid:durableId="943149712">
+  <w:num w:numId="4" w16cid:durableId="1573464003">
     <w:abstractNumId w:val="1"/>
   </w:num>
 </w:numbering>
@@ -2423,7 +2421,7 @@
     <w:hidden/>
     <w:uiPriority w:val="99"/>
     <w:semiHidden/>
-    <w:rsid w:val="00195CD5"/>
+    <w:rsid w:val="00054317"/>
     <w:pPr>
       <w:spacing w:after="0" w:line="240" w:lineRule="auto"/>
     </w:pPr>
@@ -2434,7 +2432,7 @@
     <w:link w:val="FooterChar"/>
     <w:uiPriority w:val="99"/>
     <w:unhideWhenUsed/>
-    <w:rsid w:val="00195CD5"/>
+    <w:rsid w:val="00054317"/>
     <w:pPr>
       <w:tabs>
         <w:tab w:val="center" w:pos="4513"/>
@@ -2448,7 +2446,7 @@
     <w:basedOn w:val="DefaultParagraphFont"/>
     <w:link w:val="Footer"/>
     <w:uiPriority w:val="99"/>
-    <w:rsid w:val="00195CD5"/>
+    <w:rsid w:val="00054317"/>
   </w:style>
 </w:styles>
 </file>

</xml_diff>